<commit_message>
Added algorithm explanation URL to proposal
</commit_message>
<xml_diff>
--- a/Documents/Project Proposal (k224173, k224406, k224625).docx
+++ b/Documents/Project Proposal (k224173, k224406, k224625).docx
@@ -359,8 +359,8 @@
           <w:rFonts w:hint="default" w:ascii="Ebrima" w:hAnsi="Ebrima" w:cs="Ebrima"/>
           <w:b/>
           <w:bCs/>
-          <w:i/>
-          <w:iCs/>
+          <w:i w:val="0"/>
+          <w:iCs w:val="0"/>
           <w:color w:val="1F497D" w:themeColor="text2"/>
           <w:sz w:val="20"/>
           <w:szCs w:val="20"/>
@@ -386,8 +386,8 @@
           <w:rFonts w:hint="default" w:ascii="Ebrima" w:hAnsi="Ebrima" w:cs="Ebrima"/>
           <w:b/>
           <w:bCs/>
-          <w:i/>
-          <w:iCs/>
+          <w:i w:val="0"/>
+          <w:iCs w:val="0"/>
           <w:color w:val="1F497D" w:themeColor="text2"/>
           <w:sz w:val="20"/>
           <w:szCs w:val="20"/>
@@ -413,8 +413,8 @@
           <w:rFonts w:hint="default" w:ascii="Ebrima" w:hAnsi="Ebrima" w:cs="Ebrima"/>
           <w:b/>
           <w:bCs/>
-          <w:i/>
-          <w:iCs/>
+          <w:i w:val="0"/>
+          <w:iCs w:val="0"/>
           <w:color w:val="1F497D" w:themeColor="text2"/>
           <w:sz w:val="20"/>
           <w:szCs w:val="20"/>
@@ -441,8 +441,8 @@
           <w:rFonts w:hint="default" w:ascii="Ebrima" w:hAnsi="Ebrima" w:cs="Ebrima"/>
           <w:b/>
           <w:bCs/>
-          <w:i/>
-          <w:iCs/>
+          <w:i w:val="0"/>
+          <w:iCs w:val="0"/>
           <w:sz w:val="20"/>
           <w:szCs w:val="20"/>
           <w14:textFill>
@@ -466,8 +466,8 @@
           <w:rFonts w:hint="default" w:ascii="Ebrima" w:hAnsi="Ebrima" w:cs="Ebrima"/>
           <w:b/>
           <w:bCs/>
-          <w:i/>
-          <w:iCs/>
+          <w:i w:val="0"/>
+          <w:iCs w:val="0"/>
           <w:color w:val="1F497D" w:themeColor="text2"/>
           <w:sz w:val="20"/>
           <w:szCs w:val="20"/>
@@ -559,6 +559,8 @@
         </w:rPr>
         <w:t>The code is original hence no repository is provided.</w:t>
       </w:r>
+      <w:bookmarkStart w:id="0" w:name="_GoBack"/>
+      <w:bookmarkEnd w:id="0"/>
     </w:p>
     <w:p>
       <w:pPr>
@@ -1479,8 +1481,6 @@
           <w:lang w:val="en-US"/>
         </w:rPr>
       </w:pPr>
-      <w:bookmarkStart w:id="0" w:name="_GoBack"/>
-      <w:bookmarkEnd w:id="0"/>
       <w:r>
         <w:rPr>
           <w:rFonts w:hint="default" w:ascii="Ebrima" w:hAnsi="Ebrima" w:cs="Ebrima"/>

</xml_diff>